<commit_message>
Volume 1, Chapter 9: updated lessons
</commit_message>
<xml_diff>
--- a/Volume 1/Chapter 09 - Memory Management/SPA_Vol1_Ch9_Lesson9_10_Memory_Management_Error_Handling.docx
+++ b/Volume 1/Chapter 09 - Memory Management/SPA_Vol1_Ch9_Lesson9_10_Memory_Management_Error_Handling.docx
@@ -1783,15 +1783,15 @@
         <w:pStyle w:val="SourceCode"/>
       </w:pPr>
       <w:r>
-        <w:t xml:space="preserve">    // Remember, calloc then free: calloc asks for count items of sizeof</w:t>
-      </w:r>
-    </w:p>
-    <w:p>
-      <w:pPr>
-        <w:pStyle w:val="SourceCode"/>
-      </w:pPr>
-      <w:r>
-        <w:t xml:space="preserve">    // *ports bytes each and starts every one at 0.</w:t>
+        <w:t xml:space="preserve">    // Remember, calloc then free; calloc zeroes count items of sizeof *ports</w:t>
+      </w:r>
+    </w:p>
+    <w:p>
+      <w:pPr>
+        <w:pStyle w:val="SourceCode"/>
+      </w:pPr>
+      <w:r>
+        <w:t xml:space="preserve">    // bytes. (size_t) turns the checked count into calloc's size type.</w:t>
       </w:r>
     </w:p>
     <w:p>
@@ -5508,15 +5508,15 @@
         <w:pStyle w:val="SourceCode"/>
       </w:pPr>
       <w:r>
-        <w:t>// would throw std::bad_alloc, and every buffer already made would still</w:t>
-      </w:r>
-    </w:p>
-    <w:p>
-      <w:pPr>
-        <w:pStyle w:val="SourceCode"/>
-      </w:pPr>
-      <w:r>
-        <w:t>// be deleted on the way out.</w:t>
+        <w:t>// would throw std::bad_alloc. Nothing catches it, so the program stops</w:t>
+      </w:r>
+    </w:p>
+    <w:p>
+      <w:pPr>
+        <w:pStyle w:val="SourceCode"/>
+      </w:pPr>
+      <w:r>
+        <w:t>// and no destructor runs; only a catch makes owners delete on the way out.</w:t>
       </w:r>
     </w:p>
     <w:p>
@@ -6290,7 +6290,7 @@
         <w:pStyle w:val="ListBullet"/>
       </w:pPr>
       <w:r>
-        <w:t>If memory ran out inside std::make_unique, it would throw std::bad_alloc, and every unique_ptr already made in buildReport would still delete its buffer on the way out. Remember, throw jumps to the matching catch block; real programs let bad_alloc stop the program at the top.</w:t>
+        <w:t>If memory ran out inside std::make_unique, it would throw std::bad_alloc. Nothing in this program catches it, so the program would stop and no destructor would run: the unique_ptrs already made in buildReport delete their buffers on the way out only when a catch further up is reached. Remember, throw jumps to the matching catch block; real programs let bad_alloc stop the program at the top.</w:t>
       </w:r>
     </w:p>
     <w:p>
@@ -10697,7 +10697,7 @@
         <w:pStyle w:val="SourceCode"/>
       </w:pPr>
       <w:r>
-        <w:t># releases a buffer it no longer needs. None means no buffer.</w:t>
+        <w:t># releases a buffer. None means no buffer; a field takes a : type hint too.</w:t>
       </w:r>
     </w:p>
     <w:p>
@@ -10819,31 +10819,31 @@
         <w:pStyle w:val="SourceCode"/>
       </w:pPr>
       <w:r>
-        <w:t xml:space="preserve">    # Allocation failure: if Python ran out of memory here, it would</w:t>
-      </w:r>
-    </w:p>
-    <w:p>
-      <w:pPr>
-        <w:pStyle w:val="SourceCode"/>
-      </w:pPr>
-      <w:r>
-        <w:t xml:space="preserve">    # raise MemoryError. Programs rarely catch it, because little can be</w:t>
-      </w:r>
-    </w:p>
-    <w:p>
-      <w:pPr>
-        <w:pStyle w:val="SourceCode"/>
-      </w:pPr>
-      <w:r>
-        <w:t xml:space="preserve">    # done once the whole process is out of memory; the size limit keeps</w:t>
-      </w:r>
-    </w:p>
-    <w:p>
-      <w:pPr>
-        <w:pStyle w:val="SourceCode"/>
-      </w:pPr>
-      <w:r>
-        <w:t xml:space="preserve">    # this request small. Remember, Python starts the memory at zero.</w:t>
+        <w:t xml:space="preserve">    # Allocation failure: out of memory, Python would raise MemoryError,</w:t>
+      </w:r>
+    </w:p>
+    <w:p>
+      <w:pPr>
+        <w:pStyle w:val="SourceCode"/>
+      </w:pPr>
+      <w:r>
+        <w:t xml:space="preserve">    # which programs rarely catch; the size limit keeps this request small.</w:t>
+      </w:r>
+    </w:p>
+    <w:p>
+      <w:pPr>
+        <w:pStyle w:val="SourceCode"/>
+      </w:pPr>
+      <w:r>
+        <w:t xml:space="preserve">    # Remember, "H" is an unsigned 16-bit port and itemsize its 2 bytes;</w:t>
+      </w:r>
+    </w:p>
+    <w:p>
+      <w:pPr>
+        <w:pStyle w:val="SourceCode"/>
+      </w:pPr>
+      <w:r>
+        <w:t xml:space="preserve">    # bytes(n) is n zero bytes, which array("H", ...) reads as ports.</w:t>
       </w:r>
     </w:p>
     <w:p>
@@ -10983,15 +10983,15 @@
         <w:pStyle w:val="SourceCode"/>
       </w:pPr>
       <w:r>
-        <w:t># Prints a label and every port, or "no buffer" for None. Remember, check</w:t>
-      </w:r>
-    </w:p>
-    <w:p>
-      <w:pPr>
-        <w:pStyle w:val="SourceCode"/>
-      </w:pPr>
-      <w:r>
-        <w:t># for the no-value first.</w:t>
+        <w:t># Prints a label and every port, or "no buffer" for None, checked first.</w:t>
+      </w:r>
+    </w:p>
+    <w:p>
+      <w:pPr>
+        <w:pStyle w:val="SourceCode"/>
+      </w:pPr>
+      <w:r>
+        <w:t># Remember, [value for item in list] without [ ] feeds a call one by one.</w:t>
       </w:r>
     </w:p>
     <w:p>
@@ -15994,31 +15994,31 @@
       </w:rPr>
     </w:lvl>
   </w:abstractNum>
-  <w:num w:numId="1" w16cid:durableId="1365867701">
+  <w:num w:numId="1" w16cid:durableId="678585415">
     <w:abstractNumId w:val="8"/>
   </w:num>
-  <w:num w:numId="2" w16cid:durableId="737167121">
+  <w:num w:numId="2" w16cid:durableId="2097481472">
     <w:abstractNumId w:val="6"/>
   </w:num>
-  <w:num w:numId="3" w16cid:durableId="861361248">
+  <w:num w:numId="3" w16cid:durableId="534970824">
     <w:abstractNumId w:val="5"/>
   </w:num>
-  <w:num w:numId="4" w16cid:durableId="1177619712">
+  <w:num w:numId="4" w16cid:durableId="942108790">
     <w:abstractNumId w:val="4"/>
   </w:num>
-  <w:num w:numId="5" w16cid:durableId="1481119608">
+  <w:num w:numId="5" w16cid:durableId="1774939293">
     <w:abstractNumId w:val="7"/>
   </w:num>
-  <w:num w:numId="6" w16cid:durableId="76556904">
+  <w:num w:numId="6" w16cid:durableId="637497068">
     <w:abstractNumId w:val="3"/>
   </w:num>
-  <w:num w:numId="7" w16cid:durableId="487523894">
+  <w:num w:numId="7" w16cid:durableId="1010446816">
     <w:abstractNumId w:val="2"/>
   </w:num>
-  <w:num w:numId="8" w16cid:durableId="1538812063">
+  <w:num w:numId="8" w16cid:durableId="1552955187">
     <w:abstractNumId w:val="1"/>
   </w:num>
-  <w:num w:numId="9" w16cid:durableId="1739085928">
+  <w:num w:numId="9" w16cid:durableId="1138688202">
     <w:abstractNumId w:val="0"/>
   </w:num>
 </w:numbering>

</xml_diff>